<commit_message>
remove characters that are not compatible with every IDE + update documentation + replace .yml file with .toml for venv
</commit_message>
<xml_diff>
--- a/reports/1_Summary_Report.docx
+++ b/reports/1_Summary_Report.docx
@@ -42,61 +42,7 @@
           <w:sz w:val="19"/>
           <w:szCs w:val="19"/>
         </w:rPr>
-        <w:t xml:space="preserve">Machine Learning </w:t>
-      </w:r>
-      <w:proofErr w:type="gramStart"/>
-      <w:r>
-        <w:rPr>
-          <w:color w:val="666666"/>
-          <w:sz w:val="19"/>
-          <w:szCs w:val="19"/>
-        </w:rPr>
-        <w:t>II  |</w:t>
-      </w:r>
-      <w:proofErr w:type="gramEnd"/>
-      <w:r>
-        <w:rPr>
-          <w:color w:val="666666"/>
-          <w:sz w:val="19"/>
-          <w:szCs w:val="19"/>
-        </w:rPr>
-        <w:t xml:space="preserve">  MBDS </w:t>
-      </w:r>
-      <w:proofErr w:type="gramStart"/>
-      <w:r>
-        <w:rPr>
-          <w:color w:val="666666"/>
-          <w:sz w:val="19"/>
-          <w:szCs w:val="19"/>
-        </w:rPr>
-        <w:t>2026  |</w:t>
-      </w:r>
-      <w:proofErr w:type="gramEnd"/>
-      <w:r>
-        <w:rPr>
-          <w:color w:val="666666"/>
-          <w:sz w:val="19"/>
-          <w:szCs w:val="19"/>
-        </w:rPr>
-        <w:t xml:space="preserve">  Jan · Caspar · Lea · </w:t>
-      </w:r>
-      <w:proofErr w:type="spellStart"/>
-      <w:r>
-        <w:rPr>
-          <w:color w:val="666666"/>
-          <w:sz w:val="19"/>
-          <w:szCs w:val="19"/>
-        </w:rPr>
-        <w:t>Ghezlan</w:t>
-      </w:r>
-      <w:proofErr w:type="spellEnd"/>
-      <w:r>
-        <w:rPr>
-          <w:color w:val="666666"/>
-          <w:sz w:val="19"/>
-          <w:szCs w:val="19"/>
-        </w:rPr>
-        <w:t xml:space="preserve"> · Fouad</w:t>
+        <w:t>Machine Learning II  |  MBDS 2026  |  Jan · Caspar · Lea · Ghezlan · Fouad</w:t>
       </w:r>
     </w:p>
     <w:p>
@@ -211,23 +157,13 @@
       <w:r>
         <w:t>Global supply chains are increasingly exposed to disruptions. This project develops a binary classification model that predicts whether a shipment will experience a disruption (</w:t>
       </w:r>
-      <w:proofErr w:type="spellStart"/>
       <w:r>
         <w:rPr>
           <w:rFonts w:ascii="Consolas" w:eastAsia="Consolas" w:hAnsi="Consolas" w:cs="Consolas"/>
           <w:sz w:val="19"/>
           <w:szCs w:val="19"/>
         </w:rPr>
-        <w:t>Disruption_Occurred</w:t>
-      </w:r>
-      <w:proofErr w:type="spellEnd"/>
-      <w:r>
-        <w:rPr>
-          <w:rFonts w:ascii="Consolas" w:eastAsia="Consolas" w:hAnsi="Consolas" w:cs="Consolas"/>
-          <w:sz w:val="19"/>
-          <w:szCs w:val="19"/>
-        </w:rPr>
-        <w:t xml:space="preserve"> = 1</w:t>
+        <w:t>Disruption_Occurred = 1</w:t>
       </w:r>
       <w:r>
         <w:t>), enabling logistics managers to take pre-emptive action.</w:t>
@@ -235,10 +171,7 @@
     </w:p>
     <w:p>
       <w:r>
-        <w:t xml:space="preserve">Using a dataset of 5,000 international shipments across nine major trade ports (2024–2025), we trained and compared six classification algorithms. Our best model — Logistic Regression— achieved a ROC-AUC of 0.818 and 77.0% recall, demonstrating strong predictive capability for an inherently noisy, real-world logistics </w:t>
-      </w:r>
-      <w:r>
-        <w:t>problems.</w:t>
+        <w:t>Using a dataset of 5,000 international shipments across nine major trade ports (2024–2025), we trained and compared six classification algorithms. Our best model — Logistic Regression— achieved a ROC-AUC of 0.818 and 77.0% recall, demonstrating strong predictive capability for an inherently noisy, real-world logistics problems.</w:t>
       </w:r>
     </w:p>
     <w:tbl>
@@ -645,7 +578,6 @@
                 <w:lang w:val="en-CA"/>
               </w:rPr>
             </w:pPr>
-            <w:proofErr w:type="spellStart"/>
             <w:r>
               <w:rPr>
                 <w:rFonts w:eastAsia="Times New Roman"/>
@@ -656,20 +588,7 @@
                 <w:szCs w:val="18"/>
                 <w:lang w:val="en-CA"/>
               </w:rPr>
-              <w:t>GridSearchCV</w:t>
-            </w:r>
-            <w:proofErr w:type="spellEnd"/>
-            <w:r>
-              <w:rPr>
-                <w:rFonts w:eastAsia="Times New Roman"/>
-                <w:b/>
-                <w:bCs/>
-                <w:color w:val="000000"/>
-                <w:sz w:val="18"/>
-                <w:szCs w:val="18"/>
-                <w:lang w:val="en-CA"/>
-              </w:rPr>
-              <w:t> </w:t>
+              <w:t>GridSearchCV </w:t>
             </w:r>
           </w:p>
         </w:tc>
@@ -888,15 +807,7 @@
     <w:p/>
     <w:p>
       <w:r>
-        <w:t xml:space="preserve">Transit speed (Distance per Day), weather severity, lead time, and geopolitical risk are the four most predictive factors for supply chain disruptions. Carrier reliability plays a moderate but important moderating role. This information allows the prediction of shipments most likely to be disrupted, therefore enabling operations teams to </w:t>
-      </w:r>
-      <w:proofErr w:type="gramStart"/>
-      <w:r>
-        <w:t>concentrate</w:t>
-      </w:r>
-      <w:proofErr w:type="gramEnd"/>
-      <w:r>
-        <w:t xml:space="preserve"> monitoring and contingency resources where they matter most.</w:t>
+        <w:t>Hurricane conditions, geopolitical risk, storm weather, and transport mode are the four most predictive factors for supply chain disruptions. Carrier reliability and transit speed also play important roles. This information allows the prediction of shipments most likely to be disrupted, therefore enabling operations teams to concentrate monitoring and contingency resources where they matter most.</w:t>
       </w:r>
     </w:p>
     <w:p>
@@ -913,7 +824,14 @@
         <w:t>2. Technical Approach</w:t>
       </w:r>
     </w:p>
-    <w:p/>
+    <w:p>
+      <w:pPr>
+        <w:rPr>
+          <w:b/>
+          <w:bCs/>
+        </w:rPr>
+      </w:pPr>
+    </w:p>
     <w:p>
       <w:pPr>
         <w:rPr>
@@ -937,22 +855,7 @@
         </w:rPr>
       </w:pPr>
       <w:r>
-        <w:rPr>
-          <w:b/>
-          <w:bCs/>
-        </w:rPr>
-        <w:t xml:space="preserve"> </w:t>
-      </w:r>
-      <w:r>
-        <w:t xml:space="preserve">Our approach is to train and test all classification methods studied within the class, then select the one that performs best. For this specific business problem, the </w:t>
-      </w:r>
-      <w:proofErr w:type="gramStart"/>
-      <w:r>
-        <w:t>worst case</w:t>
-      </w:r>
-      <w:proofErr w:type="gramEnd"/>
-      <w:r>
-        <w:t xml:space="preserve"> scenario is to falsely predict that there will be no disruptions. Therefore, the recall and AUC metrics will be used to select the final model. The variance of these metrics will also be taken into consideration, as the team wants to deliver a stable model.</w:t>
+        <w:t>Our approach is to train and test all classification methods studied within the class, then select the one that performs best. For this specific business problem, the worst-case scenario is to falsely predict that there will be no disruptions. Therefore, the recall and AUC metrics will be used to select the final model. The variance of these metrics will also be taken into consideration, as the team wants to deliver a stable model.</w:t>
       </w:r>
     </w:p>
     <w:p>
@@ -972,23 +875,7 @@
     </w:p>
     <w:p>
       <w:r>
-        <w:t xml:space="preserve">The file “global_supply_chain_risk_2026.csv”, which </w:t>
-      </w:r>
-      <w:proofErr w:type="gramStart"/>
-      <w:r>
-        <w:t>has  5,000</w:t>
-      </w:r>
-      <w:proofErr w:type="gramEnd"/>
-      <w:r>
-        <w:t xml:space="preserve"> records and 14 columns (11 input features, plus </w:t>
-      </w:r>
-      <w:proofErr w:type="spellStart"/>
-      <w:r>
-        <w:t>Shipment_ID</w:t>
-      </w:r>
-      <w:proofErr w:type="spellEnd"/>
-      <w:r>
-        <w:t xml:space="preserve">, Date, and the target variable) was used to train classification models. It includes information such as route details, cargo characteristics, environmental conditions, and operational metrics. </w:t>
+        <w:t xml:space="preserve">The file “global_supply_chain_risk_2026.csv”, which has  5,000 records and 14 columns (11 input features, Shipment_ID, Date, and the target variable) was used to train classification models. It includes information such as route details, cargo characteristics, environmental conditions, and operational metrics. </w:t>
       </w:r>
     </w:p>
     <w:p>
@@ -1026,47 +913,11 @@
         </w:pBdr>
         <w:spacing w:after="0"/>
       </w:pPr>
-      <w:proofErr w:type="spellStart"/>
       <w:r>
         <w:rPr>
           <w:color w:val="000000"/>
         </w:rPr>
-        <w:t>Distance_per_Day</w:t>
-      </w:r>
-      <w:proofErr w:type="spellEnd"/>
-      <w:r>
-        <w:rPr>
-          <w:color w:val="000000"/>
-        </w:rPr>
-        <w:t xml:space="preserve"> — transit speed proxy (</w:t>
-      </w:r>
-      <w:proofErr w:type="spellStart"/>
-      <w:r>
-        <w:rPr>
-          <w:color w:val="000000"/>
-        </w:rPr>
-        <w:t>Distance_km</w:t>
-      </w:r>
-      <w:proofErr w:type="spellEnd"/>
-      <w:r>
-        <w:rPr>
-          <w:color w:val="000000"/>
-        </w:rPr>
-        <w:t xml:space="preserve"> ÷ </w:t>
-      </w:r>
-      <w:proofErr w:type="spellStart"/>
-      <w:r>
-        <w:rPr>
-          <w:color w:val="000000"/>
-        </w:rPr>
-        <w:t>Lead_Time_Days</w:t>
-      </w:r>
-      <w:proofErr w:type="spellEnd"/>
-      <w:r>
-        <w:rPr>
-          <w:color w:val="000000"/>
-        </w:rPr>
-        <w:t>)</w:t>
+        <w:t>Distance_per_Day: transit speed proxy (Distance_km ÷ Lead_Time_Days)</w:t>
       </w:r>
     </w:p>
     <w:p>
@@ -1084,33 +935,11 @@
         </w:pBdr>
         <w:spacing w:after="0"/>
       </w:pPr>
-      <w:proofErr w:type="spellStart"/>
       <w:r>
         <w:rPr>
           <w:color w:val="000000"/>
         </w:rPr>
-        <w:t>Risk_Carrier_Interaction</w:t>
-      </w:r>
-      <w:proofErr w:type="spellEnd"/>
-      <w:r>
-        <w:rPr>
-          <w:color w:val="000000"/>
-        </w:rPr>
-        <w:t xml:space="preserve"> — combined exposure score (</w:t>
-      </w:r>
-      <w:proofErr w:type="spellStart"/>
-      <w:r>
-        <w:rPr>
-          <w:color w:val="000000"/>
-        </w:rPr>
-        <w:t>Geopolitical_Risk</w:t>
-      </w:r>
-      <w:proofErr w:type="spellEnd"/>
-      <w:r>
-        <w:rPr>
-          <w:color w:val="000000"/>
-        </w:rPr>
-        <w:t xml:space="preserve"> × (1−Carrier_Reliability))</w:t>
+        <w:t>Risk_Carrier_Interaction: a combined exposure score (Geopolitical_Risk × (1−Carrier_Reliability))</w:t>
       </w:r>
     </w:p>
     <w:p>
@@ -1132,7 +961,7 @@
         <w:rPr>
           <w:color w:val="000000"/>
         </w:rPr>
-        <w:t>Month and Quarter — seasonality signals extracted from shipment date</w:t>
+        <w:t>Month and Quarter: seasonality signals extracted from shipment date</w:t>
       </w:r>
     </w:p>
     <w:p>
@@ -1149,19 +978,11 @@
           <w:between w:val="nil"/>
         </w:pBdr>
       </w:pPr>
-      <w:proofErr w:type="spellStart"/>
       <w:r>
         <w:rPr>
           <w:color w:val="000000"/>
         </w:rPr>
-        <w:t>Heavy_Cargo</w:t>
-      </w:r>
-      <w:proofErr w:type="spellEnd"/>
-      <w:r>
-        <w:rPr>
-          <w:color w:val="000000"/>
-        </w:rPr>
-        <w:t xml:space="preserve"> — binary flag for above-median weight shipments</w:t>
+        <w:t>Heavy_Cargo: binary flag for above-median weight shipments</w:t>
       </w:r>
     </w:p>
     <w:p>
@@ -1175,47 +996,7 @@
         </w:pBdr>
       </w:pPr>
       <w:r>
-        <w:t xml:space="preserve">Dummy variables were also created by using one hot encoding on the </w:t>
-      </w:r>
-      <w:proofErr w:type="spellStart"/>
-      <w:r>
-        <w:t>Transport_mode</w:t>
-      </w:r>
-      <w:proofErr w:type="spellEnd"/>
-      <w:r>
-        <w:t xml:space="preserve">, </w:t>
-      </w:r>
-      <w:proofErr w:type="spellStart"/>
-      <w:r>
-        <w:t>Product_Category</w:t>
-      </w:r>
-      <w:proofErr w:type="spellEnd"/>
-      <w:r>
-        <w:t xml:space="preserve">, </w:t>
-      </w:r>
-      <w:proofErr w:type="spellStart"/>
-      <w:r>
-        <w:t>Weather_Condition</w:t>
-      </w:r>
-      <w:proofErr w:type="spellEnd"/>
-      <w:r>
-        <w:t xml:space="preserve">, </w:t>
-      </w:r>
-      <w:proofErr w:type="spellStart"/>
-      <w:r>
-        <w:t>Origin_Port</w:t>
-      </w:r>
-      <w:proofErr w:type="spellEnd"/>
-      <w:r>
-        <w:t xml:space="preserve">, and </w:t>
-      </w:r>
-      <w:proofErr w:type="spellStart"/>
-      <w:r>
-        <w:t>Destination_Port</w:t>
-      </w:r>
-      <w:proofErr w:type="spellEnd"/>
-      <w:r>
-        <w:t xml:space="preserve"> variables.</w:t>
+        <w:t>Dummy variables were also created by using one hot encoding on the Transport_mode, Product_Category, Weather_Condition, Origin_Port, and Destination_Port variables.</w:t>
       </w:r>
     </w:p>
     <w:p>
@@ -2429,39 +2210,7 @@
           <w:sz w:val="19"/>
           <w:szCs w:val="19"/>
         </w:rPr>
-        <w:t xml:space="preserve">★ Logistic Regression was selected as the best model based on highest recall (0.770) and the </w:t>
-      </w:r>
-      <w:proofErr w:type="gramStart"/>
-      <w:r>
-        <w:rPr>
-          <w:sz w:val="19"/>
-          <w:szCs w:val="19"/>
-        </w:rPr>
-        <w:t>second  most</w:t>
-      </w:r>
-      <w:proofErr w:type="gramEnd"/>
-      <w:r>
-        <w:rPr>
-          <w:sz w:val="19"/>
-          <w:szCs w:val="19"/>
-        </w:rPr>
-        <w:t xml:space="preserve"> stable cross-validation performance (lowest </w:t>
-      </w:r>
-      <w:proofErr w:type="gramStart"/>
-      <w:r>
-        <w:rPr>
-          <w:sz w:val="19"/>
-          <w:szCs w:val="19"/>
-        </w:rPr>
-        <w:t>variance)and</w:t>
-      </w:r>
-      <w:proofErr w:type="gramEnd"/>
-      <w:r>
-        <w:rPr>
-          <w:sz w:val="19"/>
-          <w:szCs w:val="19"/>
-        </w:rPr>
-        <w:t xml:space="preserve"> ROC-AUC, making it the most reliable choice for deployment.</w:t>
+        <w:t>★ Logistic Regression was selected as the best model based on highest recall (0.770) and the second  most stable cross-validation performance (lowest variance) and ROC-AUC, making it the most reliable choice for deployment.</w:t>
       </w:r>
     </w:p>
     <w:p>
@@ -2480,16 +2229,18 @@
       </w:r>
     </w:p>
     <w:p>
+      <w:pPr>
+        <w:rPr>
+          <w:sz w:val="19"/>
+          <w:szCs w:val="19"/>
+        </w:rPr>
+      </w:pPr>
       <w:r>
-        <w:t xml:space="preserve">The Logistic Regression model was fine tuned using </w:t>
-      </w:r>
-      <w:proofErr w:type="spellStart"/>
-      <w:r>
-        <w:t>GridSearchCV</w:t>
-      </w:r>
-      <w:proofErr w:type="spellEnd"/>
-      <w:r>
-        <w:t>, where each combination goes through 5-fold validation. The final results for our logistic regression are described below.</w:t>
+        <w:rPr>
+          <w:sz w:val="19"/>
+          <w:szCs w:val="19"/>
+        </w:rPr>
+        <w:t>To find the best version of the Logistic Regression model, GridSearchCV tested 12 combinations of regularization settings across 5 cross-validation folds (60 model fits in total) optimizing for recall. The best configuration selected was C=1 with L2 (Ridge) penalty. C=1 sits in the middle of the search range, applying moderate regularization. L2 regularization works by shrinking all feature coefficients toward zero rather than eliminating any outright, meaning every feature still contributes to predictions, just with controlled influence. Together, these settings produced a cross-validated recall of 75.9%, meaning the tuned model correctly identified about 3 in 4 actual disruptions on data it hadn't seen during training.</w:t>
       </w:r>
     </w:p>
     <w:tbl>
@@ -2896,7 +2647,6 @@
                 <w:lang w:val="en-CA"/>
               </w:rPr>
             </w:pPr>
-            <w:proofErr w:type="spellStart"/>
             <w:r>
               <w:rPr>
                 <w:rFonts w:eastAsia="Times New Roman"/>
@@ -2907,20 +2657,7 @@
                 <w:szCs w:val="18"/>
                 <w:lang w:val="en-CA"/>
               </w:rPr>
-              <w:t>GridSearchCV</w:t>
-            </w:r>
-            <w:proofErr w:type="spellEnd"/>
-            <w:r>
-              <w:rPr>
-                <w:rFonts w:eastAsia="Times New Roman"/>
-                <w:b/>
-                <w:bCs/>
-                <w:color w:val="000000"/>
-                <w:sz w:val="18"/>
-                <w:szCs w:val="18"/>
-                <w:lang w:val="en-CA"/>
-              </w:rPr>
-              <w:t> </w:t>
+              <w:t>GridSearchCV </w:t>
             </w:r>
           </w:p>
         </w:tc>
@@ -3179,7 +2916,7 @@
         <w:gridCol w:w="574"/>
         <w:gridCol w:w="2495"/>
         <w:gridCol w:w="1066"/>
-        <w:gridCol w:w="5040"/>
+        <w:gridCol w:w="5261"/>
       </w:tblGrid>
       <w:tr>
         <w:trPr>
@@ -3399,7 +3136,6 @@
                 <w:szCs w:val="18"/>
               </w:rPr>
             </w:pPr>
-            <w:proofErr w:type="spellStart"/>
             <w:r>
               <w:rPr>
                 <w:sz w:val="18"/>
@@ -3407,7 +3143,6 @@
               </w:rPr>
               <w:t>Weather_Condition_Hurricane</w:t>
             </w:r>
-            <w:proofErr w:type="spellEnd"/>
           </w:p>
         </w:tc>
         <w:tc>
@@ -3435,7 +3170,7 @@
                 <w:sz w:val="18"/>
                 <w:szCs w:val="18"/>
               </w:rPr>
-              <w:t>25.3%</w:t>
+              <w:t>52.3%</w:t>
             </w:r>
           </w:p>
         </w:tc>
@@ -3522,15 +3257,13 @@
                 <w:szCs w:val="18"/>
               </w:rPr>
             </w:pPr>
-            <w:proofErr w:type="spellStart"/>
             <w:r>
               <w:rPr>
                 <w:sz w:val="18"/>
                 <w:szCs w:val="18"/>
               </w:rPr>
-              <w:t>Weather_Condition_Storm</w:t>
+              <w:t>Geopolitical_Risk_Score</w:t>
             </w:r>
-            <w:proofErr w:type="spellEnd"/>
           </w:p>
         </w:tc>
         <w:tc>
@@ -3558,7 +3291,7 @@
                 <w:sz w:val="18"/>
                 <w:szCs w:val="18"/>
               </w:rPr>
-              <w:t>8.0%</w:t>
+              <w:t>12.5%</w:t>
             </w:r>
           </w:p>
         </w:tc>
@@ -3587,7 +3320,7 @@
                 <w:sz w:val="18"/>
                 <w:szCs w:val="18"/>
               </w:rPr>
-              <w:t>Bad weather negatively impacts travel conditions</w:t>
+              <w:t>Routes at geopolitical risk are more likely to experience disruption</w:t>
             </w:r>
           </w:p>
         </w:tc>
@@ -3645,106 +3378,12 @@
                 <w:szCs w:val="18"/>
               </w:rPr>
             </w:pPr>
-            <w:proofErr w:type="spellStart"/>
             <w:r>
               <w:rPr>
                 <w:sz w:val="18"/>
                 <w:szCs w:val="18"/>
               </w:rPr>
-              <w:t>Geopolitical_Risk_Score</w:t>
-            </w:r>
-            <w:proofErr w:type="spellEnd"/>
-          </w:p>
-        </w:tc>
-        <w:tc>
-          <w:tcPr>
-            <w:tcW w:w="0" w:type="auto"/>
-            <w:tcMar>
-              <w:top w:w="60" w:type="dxa"/>
-              <w:left w:w="120" w:type="dxa"/>
-              <w:bottom w:w="60" w:type="dxa"/>
-              <w:right w:w="120" w:type="dxa"/>
-            </w:tcMar>
-            <w:hideMark/>
-          </w:tcPr>
-          <w:p>
-            <w:pPr>
-              <w:spacing w:after="0" w:line="240" w:lineRule="auto"/>
-              <w:jc w:val="center"/>
-              <w:rPr>
-                <w:sz w:val="18"/>
-                <w:szCs w:val="18"/>
-              </w:rPr>
-            </w:pPr>
-            <w:r>
-              <w:rPr>
-                <w:sz w:val="18"/>
-                <w:szCs w:val="18"/>
-              </w:rPr>
-              <w:t>6.7%</w:t>
-            </w:r>
-          </w:p>
-        </w:tc>
-        <w:tc>
-          <w:tcPr>
-            <w:tcW w:w="0" w:type="auto"/>
-            <w:tcMar>
-              <w:top w:w="0" w:type="dxa"/>
-              <w:left w:w="100" w:type="dxa"/>
-              <w:bottom w:w="0" w:type="dxa"/>
-              <w:right w:w="100" w:type="dxa"/>
-            </w:tcMar>
-            <w:hideMark/>
-          </w:tcPr>
-          <w:p>
-            <w:pPr>
-              <w:spacing w:after="0" w:line="240" w:lineRule="auto"/>
-              <w:jc w:val="center"/>
-              <w:rPr>
-                <w:sz w:val="18"/>
-                <w:szCs w:val="18"/>
-              </w:rPr>
-            </w:pPr>
-            <w:r>
-              <w:rPr>
-                <w:sz w:val="18"/>
-                <w:szCs w:val="18"/>
-              </w:rPr>
-              <w:t>Routes at geopolitical risk are more likely to experience disruption</w:t>
-            </w:r>
-          </w:p>
-        </w:tc>
-      </w:tr>
-      <w:tr>
-        <w:trPr>
-          <w:trHeight w:val="435"/>
-        </w:trPr>
-        <w:tc>
-          <w:tcPr>
-            <w:tcW w:w="0" w:type="auto"/>
-            <w:tcMar>
-              <w:top w:w="60" w:type="dxa"/>
-              <w:left w:w="120" w:type="dxa"/>
-              <w:bottom w:w="60" w:type="dxa"/>
-              <w:right w:w="120" w:type="dxa"/>
-            </w:tcMar>
-            <w:hideMark/>
-          </w:tcPr>
-          <w:p>
-            <w:pPr>
-              <w:spacing w:after="0" w:line="240" w:lineRule="auto"/>
-              <w:jc w:val="center"/>
-              <w:rPr>
-                <w:sz w:val="18"/>
-                <w:szCs w:val="18"/>
-              </w:rPr>
-            </w:pPr>
-            <w:r>
-              <w:rPr>
-                <w:sz w:val="18"/>
-                <w:szCs w:val="18"/>
-              </w:rPr>
-              <w:t>4</w:t>
+              <w:t>Weather_Condition_Storm</w:t>
             </w:r>
           </w:p>
         </w:tc>
@@ -3768,43 +3407,12 @@
                 <w:szCs w:val="18"/>
               </w:rPr>
             </w:pPr>
-            <w:proofErr w:type="spellStart"/>
             <w:r>
               <w:rPr>
                 <w:sz w:val="18"/>
                 <w:szCs w:val="18"/>
               </w:rPr>
-              <w:t>Weather_Condition_Fog</w:t>
-            </w:r>
-            <w:proofErr w:type="spellEnd"/>
-          </w:p>
-        </w:tc>
-        <w:tc>
-          <w:tcPr>
-            <w:tcW w:w="0" w:type="auto"/>
-            <w:tcMar>
-              <w:top w:w="60" w:type="dxa"/>
-              <w:left w:w="120" w:type="dxa"/>
-              <w:bottom w:w="60" w:type="dxa"/>
-              <w:right w:w="120" w:type="dxa"/>
-            </w:tcMar>
-            <w:hideMark/>
-          </w:tcPr>
-          <w:p>
-            <w:pPr>
-              <w:spacing w:after="0" w:line="240" w:lineRule="auto"/>
-              <w:jc w:val="center"/>
-              <w:rPr>
-                <w:sz w:val="18"/>
-                <w:szCs w:val="18"/>
-              </w:rPr>
-            </w:pPr>
-            <w:r>
-              <w:rPr>
-                <w:sz w:val="18"/>
-                <w:szCs w:val="18"/>
-              </w:rPr>
-              <w:t>2.7%</w:t>
+              <w:t>12.0%</w:t>
             </w:r>
           </w:p>
         </w:tc>
@@ -3867,7 +3475,7 @@
                 <w:sz w:val="18"/>
                 <w:szCs w:val="18"/>
               </w:rPr>
-              <w:t>5</w:t>
+              <w:t>4</w:t>
             </w:r>
           </w:p>
         </w:tc>
@@ -3891,15 +3499,13 @@
                 <w:szCs w:val="18"/>
               </w:rPr>
             </w:pPr>
-            <w:proofErr w:type="spellStart"/>
             <w:r>
               <w:rPr>
                 <w:sz w:val="18"/>
                 <w:szCs w:val="18"/>
               </w:rPr>
-              <w:t>Distance_per_Day</w:t>
+              <w:t>Weather_Condition_Fog</w:t>
             </w:r>
-            <w:proofErr w:type="spellEnd"/>
           </w:p>
         </w:tc>
         <w:tc>
@@ -3927,7 +3533,7 @@
                 <w:sz w:val="18"/>
                 <w:szCs w:val="18"/>
               </w:rPr>
-              <w:t>2.6%</w:t>
+              <w:t>5.6%</w:t>
             </w:r>
           </w:p>
         </w:tc>
@@ -3956,7 +3562,7 @@
                 <w:sz w:val="18"/>
                 <w:szCs w:val="18"/>
               </w:rPr>
-              <w:t>Longer routes = more risk exposure</w:t>
+              <w:t>Bad weather negatively impacts travel conditions</w:t>
             </w:r>
           </w:p>
         </w:tc>
@@ -3990,6 +3596,128 @@
                 <w:sz w:val="18"/>
                 <w:szCs w:val="18"/>
               </w:rPr>
+              <w:lastRenderedPageBreak/>
+              <w:t>5</w:t>
+            </w:r>
+          </w:p>
+        </w:tc>
+        <w:tc>
+          <w:tcPr>
+            <w:tcW w:w="0" w:type="auto"/>
+            <w:tcMar>
+              <w:top w:w="60" w:type="dxa"/>
+              <w:left w:w="120" w:type="dxa"/>
+              <w:bottom w:w="60" w:type="dxa"/>
+              <w:right w:w="120" w:type="dxa"/>
+            </w:tcMar>
+            <w:hideMark/>
+          </w:tcPr>
+          <w:p>
+            <w:pPr>
+              <w:spacing w:after="0" w:line="240" w:lineRule="auto"/>
+              <w:jc w:val="center"/>
+              <w:rPr>
+                <w:sz w:val="18"/>
+                <w:szCs w:val="18"/>
+              </w:rPr>
+            </w:pPr>
+            <w:r>
+              <w:rPr>
+                <w:sz w:val="18"/>
+                <w:szCs w:val="18"/>
+              </w:rPr>
+              <w:t>Transport_Mode_Sea</w:t>
+            </w:r>
+          </w:p>
+        </w:tc>
+        <w:tc>
+          <w:tcPr>
+            <w:tcW w:w="0" w:type="auto"/>
+            <w:tcMar>
+              <w:top w:w="60" w:type="dxa"/>
+              <w:left w:w="120" w:type="dxa"/>
+              <w:bottom w:w="60" w:type="dxa"/>
+              <w:right w:w="120" w:type="dxa"/>
+            </w:tcMar>
+            <w:hideMark/>
+          </w:tcPr>
+          <w:p>
+            <w:pPr>
+              <w:spacing w:after="0" w:line="240" w:lineRule="auto"/>
+              <w:jc w:val="center"/>
+              <w:rPr>
+                <w:sz w:val="18"/>
+                <w:szCs w:val="18"/>
+              </w:rPr>
+            </w:pPr>
+            <w:r>
+              <w:rPr>
+                <w:sz w:val="18"/>
+                <w:szCs w:val="18"/>
+              </w:rPr>
+              <w:t>4.6%</w:t>
+            </w:r>
+          </w:p>
+        </w:tc>
+        <w:tc>
+          <w:tcPr>
+            <w:tcW w:w="0" w:type="auto"/>
+            <w:tcMar>
+              <w:top w:w="0" w:type="dxa"/>
+              <w:left w:w="100" w:type="dxa"/>
+              <w:bottom w:w="0" w:type="dxa"/>
+              <w:right w:w="100" w:type="dxa"/>
+            </w:tcMar>
+            <w:hideMark/>
+          </w:tcPr>
+          <w:p>
+            <w:pPr>
+              <w:spacing w:after="0" w:line="240" w:lineRule="auto"/>
+              <w:jc w:val="center"/>
+              <w:rPr>
+                <w:sz w:val="18"/>
+                <w:szCs w:val="18"/>
+              </w:rPr>
+            </w:pPr>
+            <w:r>
+              <w:rPr>
+                <w:sz w:val="18"/>
+                <w:szCs w:val="18"/>
+              </w:rPr>
+              <w:t>Greater exposure and longer transit windows make sea routes riskier</w:t>
+            </w:r>
+          </w:p>
+        </w:tc>
+      </w:tr>
+      <w:tr>
+        <w:trPr>
+          <w:trHeight w:val="435"/>
+        </w:trPr>
+        <w:tc>
+          <w:tcPr>
+            <w:tcW w:w="0" w:type="auto"/>
+            <w:tcMar>
+              <w:top w:w="60" w:type="dxa"/>
+              <w:left w:w="120" w:type="dxa"/>
+              <w:bottom w:w="60" w:type="dxa"/>
+              <w:right w:w="120" w:type="dxa"/>
+            </w:tcMar>
+            <w:hideMark/>
+          </w:tcPr>
+          <w:p>
+            <w:pPr>
+              <w:spacing w:after="0" w:line="240" w:lineRule="auto"/>
+              <w:jc w:val="center"/>
+              <w:rPr>
+                <w:sz w:val="18"/>
+                <w:szCs w:val="18"/>
+              </w:rPr>
+            </w:pPr>
+            <w:r>
+              <w:rPr>
+                <w:sz w:val="18"/>
+                <w:szCs w:val="18"/>
+              </w:rPr>
               <w:t>6</w:t>
             </w:r>
           </w:p>
@@ -4014,21 +3742,12 @@
                 <w:szCs w:val="18"/>
               </w:rPr>
             </w:pPr>
-            <w:proofErr w:type="spellStart"/>
             <w:r>
               <w:rPr>
                 <w:sz w:val="18"/>
                 <w:szCs w:val="18"/>
               </w:rPr>
-              <w:t>Origin_Port_Los</w:t>
-            </w:r>
-            <w:proofErr w:type="spellEnd"/>
-            <w:r>
-              <w:rPr>
-                <w:sz w:val="18"/>
-                <w:szCs w:val="18"/>
-              </w:rPr>
-              <w:t xml:space="preserve"> Angeles</w:t>
+              <w:t>Carrier_Reliability_Score</w:t>
             </w:r>
           </w:p>
         </w:tc>
@@ -4057,7 +3776,7 @@
                 <w:sz w:val="18"/>
                 <w:szCs w:val="18"/>
               </w:rPr>
-              <w:t>2.6%</w:t>
+              <w:t>4.6%</w:t>
             </w:r>
           </w:p>
         </w:tc>
@@ -4086,7 +3805,7 @@
                 <w:sz w:val="18"/>
                 <w:szCs w:val="18"/>
               </w:rPr>
-              <w:t>Reliable carriers reduce disruption</w:t>
+              <w:t>Lower carrier reliability significantly compounds disruption risk</w:t>
             </w:r>
           </w:p>
         </w:tc>
@@ -4120,7 +3839,6 @@
                 <w:sz w:val="18"/>
                 <w:szCs w:val="18"/>
               </w:rPr>
-              <w:lastRenderedPageBreak/>
               <w:t>7</w:t>
             </w:r>
           </w:p>
@@ -4145,15 +3863,13 @@
                 <w:szCs w:val="18"/>
               </w:rPr>
             </w:pPr>
-            <w:proofErr w:type="spellStart"/>
             <w:r>
               <w:rPr>
                 <w:sz w:val="18"/>
                 <w:szCs w:val="18"/>
               </w:rPr>
-              <w:t>Transport_Mode_Sea</w:t>
+              <w:t>Transport_Mode_Rail</w:t>
             </w:r>
-            <w:proofErr w:type="spellEnd"/>
           </w:p>
         </w:tc>
         <w:tc>
@@ -4181,7 +3897,7 @@
                 <w:sz w:val="18"/>
                 <w:szCs w:val="18"/>
               </w:rPr>
-              <w:t>2.5%</w:t>
+              <w:t>4.5%</w:t>
             </w:r>
           </w:p>
         </w:tc>
@@ -4210,7 +3926,7 @@
                 <w:sz w:val="18"/>
                 <w:szCs w:val="18"/>
               </w:rPr>
-              <w:t>Greater exposure and transit windows making sea route riskier</w:t>
+              <w:t>Rail routes show elevated disruption exposure relative to other modes</w:t>
             </w:r>
           </w:p>
         </w:tc>
@@ -4268,15 +3984,13 @@
                 <w:szCs w:val="18"/>
               </w:rPr>
             </w:pPr>
-            <w:proofErr w:type="spellStart"/>
             <w:r>
               <w:rPr>
                 <w:sz w:val="18"/>
                 <w:szCs w:val="18"/>
               </w:rPr>
-              <w:t>Carrier_Reliability_Score</w:t>
+              <w:t>Distance_per_Day</w:t>
             </w:r>
-            <w:proofErr w:type="spellEnd"/>
           </w:p>
         </w:tc>
         <w:tc>
@@ -4304,7 +4018,7 @@
                 <w:sz w:val="18"/>
                 <w:szCs w:val="18"/>
               </w:rPr>
-              <w:t>2.4%</w:t>
+              <w:t>3.9%</w:t>
             </w:r>
           </w:p>
         </w:tc>
@@ -4333,7 +4047,7 @@
                 <w:sz w:val="18"/>
                 <w:szCs w:val="18"/>
               </w:rPr>
-              <w:t>Unreliable carriers compound risk</w:t>
+              <w:t>Higher transit speed increases disruption risk</w:t>
             </w:r>
           </w:p>
         </w:tc>
@@ -4362,34 +4076,6 @@
     </w:p>
     <w:p>
       <w:pPr>
-        <w:rPr>
-          <w:b/>
-          <w:bCs/>
-        </w:rPr>
-      </w:pPr>
-      <w:r>
-        <w:rPr>
-          <w:b/>
-          <w:bCs/>
-        </w:rPr>
-        <w:t>Transport mode</w:t>
-      </w:r>
-    </w:p>
-    <w:p>
-      <w:r>
-        <w:t xml:space="preserve">Rail and Sea routes showed higher disruption rates than Air, likely due to longer transit windows and greater weather exposure. Air shipments, despite higher </w:t>
-      </w:r>
-      <w:proofErr w:type="gramStart"/>
-      <w:r>
-        <w:t>cost</w:t>
-      </w:r>
-      <w:proofErr w:type="gramEnd"/>
-      <w:r>
-        <w:t>, offer greater reliability.</w:t>
-      </w:r>
-    </w:p>
-    <w:p>
-      <w:pPr>
         <w:pStyle w:val="Heading2"/>
         <w:rPr>
           <w:color w:val="1F3864"/>
@@ -4410,25 +4096,7 @@
           <w:bCs/>
           <w:color w:val="1F3864"/>
         </w:rPr>
-        <w:t xml:space="preserve">1. </w:t>
-      </w:r>
-      <w:proofErr w:type="spellStart"/>
-      <w:r>
-        <w:rPr>
-          <w:b/>
-          <w:bCs/>
-          <w:color w:val="1F3864"/>
-        </w:rPr>
-        <w:t>Prioritise</w:t>
-      </w:r>
-      <w:proofErr w:type="spellEnd"/>
-      <w:r>
-        <w:rPr>
-          <w:b/>
-          <w:bCs/>
-          <w:color w:val="1F3864"/>
-        </w:rPr>
-        <w:t xml:space="preserve"> carrier selection on high-risk routes</w:t>
+        <w:t>1. Prioritise carrier selection on high-risk routes</w:t>
       </w:r>
     </w:p>
     <w:p>
@@ -4485,13 +4153,8 @@
       <w:pPr>
         <w:spacing w:after="40"/>
       </w:pPr>
-      <w:proofErr w:type="spellStart"/>
       <w:r>
-        <w:t>Distance_per_Day</w:t>
-      </w:r>
-      <w:proofErr w:type="spellEnd"/>
-      <w:r>
-        <w:t xml:space="preserve"> is the strongest predictor — overly aggressive shipping schedules increase risk. Managers should review routes where transit speed exceeds historical norms.</w:t>
+        <w:t>Distance_per_Day is the strongest predictor — overly aggressive shipping schedules increase risk. Managers should review routes where transit speed exceeds historical norms.</w:t>
       </w:r>
     </w:p>
     <w:p>
@@ -4559,15 +4222,7 @@
     </w:p>
     <w:p>
       <w:r>
-        <w:t xml:space="preserve">The model's key value lies not in perfect prediction, but in systematic risk </w:t>
-      </w:r>
-      <w:proofErr w:type="spellStart"/>
-      <w:r>
-        <w:t>prioritisation</w:t>
-      </w:r>
-      <w:proofErr w:type="spellEnd"/>
-      <w:r>
-        <w:t>: identifying the ~20% of shipments most likely to be disrupted allows operations teams to concentrate monitoring and contingency resources where they matter most.</w:t>
+        <w:t>The model's key value lies not in perfect prediction, but in systematic risk prioritisation: identifying the ~20% of shipments most likely to be disrupted allows operations teams to concentrate monitoring and contingency resources where they matter most.</w:t>
       </w:r>
     </w:p>
     <w:p>
@@ -4599,61 +4254,7 @@
           <w:sz w:val="16"/>
           <w:szCs w:val="16"/>
         </w:rPr>
-        <w:t xml:space="preserve">Submitted by: Jan, Caspar, Lea, </w:t>
-      </w:r>
-      <w:proofErr w:type="spellStart"/>
-      <w:r>
-        <w:rPr>
-          <w:color w:val="666666"/>
-          <w:sz w:val="16"/>
-          <w:szCs w:val="16"/>
-        </w:rPr>
-        <w:t>Ghezlan</w:t>
-      </w:r>
-      <w:proofErr w:type="spellEnd"/>
-      <w:r>
-        <w:rPr>
-          <w:color w:val="666666"/>
-          <w:sz w:val="16"/>
-          <w:szCs w:val="16"/>
-        </w:rPr>
-        <w:t xml:space="preserve">, </w:t>
-      </w:r>
-      <w:proofErr w:type="gramStart"/>
-      <w:r>
-        <w:rPr>
-          <w:color w:val="666666"/>
-          <w:sz w:val="16"/>
-          <w:szCs w:val="16"/>
-        </w:rPr>
-        <w:t>Fouad  |</w:t>
-      </w:r>
-      <w:proofErr w:type="gramEnd"/>
-      <w:r>
-        <w:rPr>
-          <w:color w:val="666666"/>
-          <w:sz w:val="16"/>
-          <w:szCs w:val="16"/>
-        </w:rPr>
-        <w:t xml:space="preserve">  Machine Learning II — MBDS </w:t>
-      </w:r>
-      <w:proofErr w:type="gramStart"/>
-      <w:r>
-        <w:rPr>
-          <w:color w:val="666666"/>
-          <w:sz w:val="16"/>
-          <w:szCs w:val="16"/>
-        </w:rPr>
-        <w:t>2026  |</w:t>
-      </w:r>
-      <w:proofErr w:type="gramEnd"/>
-      <w:r>
-        <w:rPr>
-          <w:color w:val="666666"/>
-          <w:sz w:val="16"/>
-          <w:szCs w:val="16"/>
-        </w:rPr>
-        <w:t xml:space="preserve">  Deadline: March 22, 2026</w:t>
+        <w:t>Submitted by: Jan, Caspar, Lea, Ghezlan, Fouad  |  Machine Learning II — MBDS 2026  |  Deadline: March 22, 2026</w:t>
       </w:r>
     </w:p>
     <w:sectPr>
@@ -5688,6 +5289,7 @@
   <w:style w:type="character" w:default="1" w:styleId="DefaultParagraphFont">
     <w:name w:val="Default Paragraph Font"/>
     <w:uiPriority w:val="1"/>
+    <w:semiHidden/>
     <w:unhideWhenUsed/>
   </w:style>
   <w:style w:type="table" w:default="1" w:styleId="TableNormal">

</xml_diff>